<commit_message>
add presentation and finalize report links
</commit_message>
<xml_diff>
--- a/recipe_report_v4.docx
+++ b/recipe_report_v4.docx
@@ -91,15 +91,7 @@
         <w:jc w:val="center"/>
       </w:pPr>
       <w:r>
-        <w:rPr>
-          <w:rFonts w:ascii="Times New Roman" w:cs="Times New Roman" w:eastAsia="Times New Roman" w:hAnsi="Times New Roman"/>
-          <w:b/>
-          <w:bCs/>
-          <w:color w:val="000000"/>
-          <w:sz w:val="24"/>
-          <w:szCs w:val="24"/>
-        </w:rPr>
-        <w:t xml:space="preserve">Team Name: Bias and Variance</w:t>
+        <w:t>Team Name: Bias &amp; Variance</w:t>
       </w:r>
     </w:p>
     <w:p>
@@ -550,15 +542,7 @@
         <w:jc w:val="both"/>
       </w:pPr>
       <w:r>
-        <w:rPr>
-          <w:rFonts w:ascii="Times New Roman" w:cs="Times New Roman" w:eastAsia="Times New Roman" w:hAnsi="Times New Roman"/>
-          <w:b w:val="false"/>
-          <w:bCs w:val="false"/>
-          <w:color w:val="000000"/>
-          <w:sz w:val="24"/>
-          <w:szCs w:val="24"/>
-        </w:rPr>
-        <w:t xml:space="preserve">GitHub Repository: [INSERT GITHUB REPO URL]</w:t>
+        <w:t>GitHub Repository: https://github.com/Sharvin27/BigDataFinal</w:t>
       </w:r>
     </w:p>
     <w:p>
@@ -567,15 +551,7 @@
         <w:jc w:val="both"/>
       </w:pPr>
       <w:r>
-        <w:rPr>
-          <w:rFonts w:ascii="Times New Roman" w:cs="Times New Roman" w:eastAsia="Times New Roman" w:hAnsi="Times New Roman"/>
-          <w:b w:val="false"/>
-          <w:bCs w:val="false"/>
-          <w:color w:val="000000"/>
-          <w:sz w:val="24"/>
-          <w:szCs w:val="24"/>
-        </w:rPr>
-        <w:t xml:space="preserve">README: [INSERT README URL]</w:t>
+        <w:t>README: https://github.com/Sharvin27/BigDataFinal/blob/main/README.md#quick-start-google-colab</w:t>
       </w:r>
     </w:p>
     <w:p>
@@ -994,15 +970,7 @@
         <w:jc w:val="both"/>
       </w:pPr>
       <w:r>
-        <w:rPr>
-          <w:rFonts w:ascii="Times New Roman" w:cs="Times New Roman" w:eastAsia="Times New Roman" w:hAnsi="Times New Roman"/>
-          <w:b w:val="false"/>
-          <w:bCs w:val="false"/>
-          <w:color w:val="000000"/>
-          <w:sz w:val="24"/>
-          <w:szCs w:val="24"/>
-        </w:rPr>
-        <w:t xml:space="preserve">Our original proposal described Kafka and HDFS as core parts of the pipeline that would actively run during the project. In practice, we kept both of them in the codebase under CLUSTER_MODE, but for the actual demo we swapped them out for local alternatives that work in Colab. Kafka ingestion became an in-memory queue simulation and HDFS paths became local file paths. This was not us cutting corners; it was a decision we made early so the demo would not break mid-presentation. The full cluster-ready code is still there in the notebook.</w:t>
+        <w:t>Our original proposal described Kafka and HDFS as active pipeline components. In the final implementation, we preserved both through CLUSTER_MODE, but used Colab-safe local alternatives for the live demonstration environment. Kafka ingestion is represented through an in-memory queue simulation and HDFS-backed storage is replaced with local persistence in demo mode. This environment-aware design allowed us to keep the intended architecture while ensuring that the notebook ran reliably during the presentation.</w:t>
       </w:r>
     </w:p>
     <w:p>
@@ -5575,15 +5543,7 @@
           </w:tcPr>
           <w:p>
             <w:r>
-              <w:rPr>
-                <w:rFonts w:ascii="Times New Roman" w:cs="Times New Roman" w:eastAsia="Times New Roman" w:hAnsi="Times New Roman"/>
-                <w:b w:val="false"/>
-                <w:bCs w:val="false"/>
-                <w:color w:val="000000"/>
-                <w:sz w:val="24"/>
-                <w:szCs w:val="24"/>
-              </w:rPr>
-              <w:t xml:space="preserve">Top-N recommendations generated</w:t>
+              <w:t>Top-N recommendations generated for trained users</w:t>
             </w:r>
           </w:p>
         </w:tc>
@@ -5891,6 +5851,16 @@
           <w:szCs w:val="24"/>
         </w:rPr>
         <w:t xml:space="preserve">Figure 4. Full results summary printed by the final cell of the notebook after a complete end-to-end run.</w:t>
+      </w:r>
+    </w:p>
+    <w:p>
+      <w:r>
+        <w:t>The final results indicate that the ALS pipeline achieved stable predictive performance on a highly sparse user-recipe matrix. After filtering, the model trained on 586,159 ratings across 21,973 users and 50,716 recipes, with held-out test performance of RMSE = 0.6477 and MAE = 0.4685. These values show that the system was able to produce useful explicit-feedback predictions while remaining scalable to a large interaction dataset.</w:t>
+      </w:r>
+    </w:p>
+    <w:p>
+      <w:r>
+        <w:t>The project artifacts also demonstrate reproducibility and deployment readiness. The notebook saves processed Parquet datasets, exports a metrics summary, persists the trained ALS model, and includes a streaming-style feedback ingestion demo that appends new user events for scheduled retraining workflows.</w:t>
       </w:r>
     </w:p>
     <w:sectPr>

</xml_diff>

<commit_message>
embed report figures and finalize report
</commit_message>
<xml_diff>
--- a/recipe_report_v4.docx
+++ b/recipe_report_v4.docx
@@ -2556,6 +2556,45 @@
     </w:p>
     <w:p>
       <w:pPr>
+        <w:jc w:val="center"/>
+      </w:pPr>
+      <w:r>
+        <w:drawing>
+          <wp:inline xmlns:a="http://schemas.openxmlformats.org/drawingml/2006/main" xmlns:pic="http://schemas.openxmlformats.org/drawingml/2006/picture">
+            <wp:extent cx="5943600" cy="3898696"/>
+            <wp:docPr id="1" name="Picture 1"/>
+            <wp:cNvGraphicFramePr>
+              <a:graphicFrameLocks noChangeAspect="1"/>
+            </wp:cNvGraphicFramePr>
+            <a:graphic>
+              <a:graphicData uri="http://schemas.openxmlformats.org/drawingml/2006/picture">
+                <pic:pic>
+                  <pic:nvPicPr>
+                    <pic:cNvPr id="0" name="figure1_recommendations.png"/>
+                    <pic:cNvPicPr/>
+                  </pic:nvPicPr>
+                  <pic:blipFill>
+                    <a:blip r:embed="rId8"/>
+                    <a:stretch>
+                      <a:fillRect/>
+                    </a:stretch>
+                  </pic:blipFill>
+                  <pic:spPr>
+                    <a:xfrm>
+                      <a:off x="0" y="0"/>
+                      <a:ext cx="5943600" cy="3898696"/>
+                    </a:xfrm>
+                    <a:prstGeom prst="rect"/>
+                  </pic:spPr>
+                </pic:pic>
+              </a:graphicData>
+            </a:graphic>
+          </wp:inline>
+        </w:drawing>
+      </w:r>
+    </w:p>
+    <w:p>
+      <w:pPr>
         <w:spacing w:after="30" w:before="80"/>
       </w:pPr>
       <w:r>
@@ -3652,6 +3691,45 @@
     </w:p>
     <w:p>
       <w:pPr>
+        <w:jc w:val="center"/>
+      </w:pPr>
+      <w:r>
+        <w:drawing>
+          <wp:inline xmlns:a="http://schemas.openxmlformats.org/drawingml/2006/main" xmlns:pic="http://schemas.openxmlformats.org/drawingml/2006/picture">
+            <wp:extent cx="5486400" cy="3598796"/>
+            <wp:docPr id="2" name="Picture 2"/>
+            <wp:cNvGraphicFramePr>
+              <a:graphicFrameLocks noChangeAspect="1"/>
+            </wp:cNvGraphicFramePr>
+            <a:graphic>
+              <a:graphicData uri="http://schemas.openxmlformats.org/drawingml/2006/picture">
+                <pic:pic>
+                  <pic:nvPicPr>
+                    <pic:cNvPr id="0" name="figure2_predictions.png"/>
+                    <pic:cNvPicPr/>
+                  </pic:nvPicPr>
+                  <pic:blipFill>
+                    <a:blip r:embed="rId9"/>
+                    <a:stretch>
+                      <a:fillRect/>
+                    </a:stretch>
+                  </pic:blipFill>
+                  <pic:spPr>
+                    <a:xfrm>
+                      <a:off x="0" y="0"/>
+                      <a:ext cx="5486400" cy="3598796"/>
+                    </a:xfrm>
+                    <a:prstGeom prst="rect"/>
+                  </pic:spPr>
+                </pic:pic>
+              </a:graphicData>
+            </a:graphic>
+          </wp:inline>
+        </w:drawing>
+      </w:r>
+    </w:p>
+    <w:p>
+      <w:pPr>
         <w:spacing w:after="30" w:before="80"/>
       </w:pPr>
       <w:r>
@@ -3909,6 +3987,45 @@
           <w:szCs w:val="24"/>
         </w:rPr>
         <w:t xml:space="preserve">Figure 3. Console output of the simulated Kafka streaming demo, showing 10 events produced and consumed via the in-memory queue.</w:t>
+      </w:r>
+    </w:p>
+    <w:p>
+      <w:pPr>
+        <w:jc w:val="center"/>
+      </w:pPr>
+      <w:r>
+        <w:drawing>
+          <wp:inline xmlns:a="http://schemas.openxmlformats.org/drawingml/2006/main" xmlns:pic="http://schemas.openxmlformats.org/drawingml/2006/picture">
+            <wp:extent cx="5943600" cy="4492335"/>
+            <wp:docPr id="3" name="Picture 3"/>
+            <wp:cNvGraphicFramePr>
+              <a:graphicFrameLocks noChangeAspect="1"/>
+            </wp:cNvGraphicFramePr>
+            <a:graphic>
+              <a:graphicData uri="http://schemas.openxmlformats.org/drawingml/2006/picture">
+                <pic:pic>
+                  <pic:nvPicPr>
+                    <pic:cNvPr id="0" name="figure3_streaming.png"/>
+                    <pic:cNvPicPr/>
+                  </pic:nvPicPr>
+                  <pic:blipFill>
+                    <a:blip r:embed="rId10"/>
+                    <a:stretch>
+                      <a:fillRect/>
+                    </a:stretch>
+                  </pic:blipFill>
+                  <pic:spPr>
+                    <a:xfrm>
+                      <a:off x="0" y="0"/>
+                      <a:ext cx="5943600" cy="4492335"/>
+                    </a:xfrm>
+                    <a:prstGeom prst="rect"/>
+                  </pic:spPr>
+                </pic:pic>
+              </a:graphicData>
+            </a:graphic>
+          </wp:inline>
+        </w:drawing>
       </w:r>
     </w:p>
     <w:p>
@@ -5851,6 +5968,89 @@
           <w:szCs w:val="24"/>
         </w:rPr>
         <w:t xml:space="preserve">Figure 4. Full results summary printed by the final cell of the notebook after a complete end-to-end run.</w:t>
+      </w:r>
+    </w:p>
+    <w:p>
+      <w:pPr>
+        <w:jc w:val="center"/>
+      </w:pPr>
+      <w:r>
+        <w:drawing>
+          <wp:inline xmlns:a="http://schemas.openxmlformats.org/drawingml/2006/main" xmlns:pic="http://schemas.openxmlformats.org/drawingml/2006/picture">
+            <wp:extent cx="5943600" cy="8523620"/>
+            <wp:docPr id="4" name="Picture 4"/>
+            <wp:cNvGraphicFramePr>
+              <a:graphicFrameLocks noChangeAspect="1"/>
+            </wp:cNvGraphicFramePr>
+            <a:graphic>
+              <a:graphicData uri="http://schemas.openxmlformats.org/drawingml/2006/picture">
+                <pic:pic>
+                  <pic:nvPicPr>
+                    <pic:cNvPr id="0" name="figure4_summary.png"/>
+                    <pic:cNvPicPr/>
+                  </pic:nvPicPr>
+                  <pic:blipFill>
+                    <a:blip r:embed="rId11"/>
+                    <a:stretch>
+                      <a:fillRect/>
+                    </a:stretch>
+                  </pic:blipFill>
+                  <pic:spPr>
+                    <a:xfrm>
+                      <a:off x="0" y="0"/>
+                      <a:ext cx="5943600" cy="8523620"/>
+                    </a:xfrm>
+                    <a:prstGeom prst="rect"/>
+                  </pic:spPr>
+                </pic:pic>
+              </a:graphicData>
+            </a:graphic>
+          </wp:inline>
+        </w:drawing>
+      </w:r>
+    </w:p>
+    <w:p>
+      <w:r>
+        <w:t>Figure 5. Spark-based EDA plots showing rating distribution, top-rated recipes by interaction count, and recipe cooking-time buckets.</w:t>
+      </w:r>
+    </w:p>
+    <w:p>
+      <w:pPr>
+        <w:jc w:val="center"/>
+      </w:pPr>
+      <w:r>
+        <w:drawing>
+          <wp:inline xmlns:a="http://schemas.openxmlformats.org/drawingml/2006/main" xmlns:pic="http://schemas.openxmlformats.org/drawingml/2006/picture">
+            <wp:extent cx="5943600" cy="1329847"/>
+            <wp:docPr id="5" name="Picture 5"/>
+            <wp:cNvGraphicFramePr>
+              <a:graphicFrameLocks noChangeAspect="1"/>
+            </wp:cNvGraphicFramePr>
+            <a:graphic>
+              <a:graphicData uri="http://schemas.openxmlformats.org/drawingml/2006/picture">
+                <pic:pic>
+                  <pic:nvPicPr>
+                    <pic:cNvPr id="0" name="eda_plots.png"/>
+                    <pic:cNvPicPr/>
+                  </pic:nvPicPr>
+                  <pic:blipFill>
+                    <a:blip r:embed="rId12"/>
+                    <a:stretch>
+                      <a:fillRect/>
+                    </a:stretch>
+                  </pic:blipFill>
+                  <pic:spPr>
+                    <a:xfrm>
+                      <a:off x="0" y="0"/>
+                      <a:ext cx="5943600" cy="1329847"/>
+                    </a:xfrm>
+                    <a:prstGeom prst="rect"/>
+                  </pic:spPr>
+                </pic:pic>
+              </a:graphicData>
+            </a:graphic>
+          </wp:inline>
+        </w:drawing>
       </w:r>
     </w:p>
     <w:p>

</xml_diff>